<commit_message>
added streamlit dashboard with shap and llm integration
</commit_message>
<xml_diff>
--- a/reports/project_notes.docx
+++ b/reports/project_notes.docx
@@ -658,6 +658,578 @@
           <w:szCs w:val="24"/>
         </w:rPr>
         <w:t>Saved: reports/accuracy_comparison.png</w:t>
+      </w:r>
+    </w:p>
+    <w:p>
+      <w:pPr>
+        <w:rPr>
+          <w:sz w:val="24"/>
+          <w:szCs w:val="24"/>
+        </w:rPr>
+      </w:pPr>
+    </w:p>
+    <w:p>
+      <w:pPr>
+        <w:rPr>
+          <w:sz w:val="24"/>
+          <w:szCs w:val="24"/>
+        </w:rPr>
+      </w:pPr>
+      <w:r>
+        <w:rPr>
+          <w:sz w:val="24"/>
+          <w:szCs w:val="24"/>
+        </w:rPr>
+        <w:t>=== DAY 8 - 25 May 2026 ===</w:t>
+      </w:r>
+    </w:p>
+    <w:p>
+      <w:pPr>
+        <w:rPr>
+          <w:sz w:val="24"/>
+          <w:szCs w:val="24"/>
+        </w:rPr>
+      </w:pPr>
+      <w:r>
+        <w:rPr>
+          <w:sz w:val="24"/>
+          <w:szCs w:val="24"/>
+        </w:rPr>
+        <w:t>GitHub repo created: github.com/Vaishali0618/network-ids-ml</w:t>
+      </w:r>
+    </w:p>
+    <w:p>
+      <w:pPr>
+        <w:rPr>
+          <w:sz w:val="24"/>
+          <w:szCs w:val="24"/>
+        </w:rPr>
+      </w:pPr>
+      <w:r>
+        <w:rPr>
+          <w:sz w:val="24"/>
+          <w:szCs w:val="24"/>
+        </w:rPr>
+        <w:t>Pushed: notebooks/, reports/, README.md</w:t>
+      </w:r>
+    </w:p>
+    <w:p>
+      <w:pPr>
+        <w:rPr>
+          <w:sz w:val="24"/>
+          <w:szCs w:val="24"/>
+        </w:rPr>
+      </w:pPr>
+      <w:r>
+        <w:rPr>
+          <w:sz w:val="24"/>
+          <w:szCs w:val="24"/>
+        </w:rPr>
+        <w:t>Data and models excluded (too large)</w:t>
+      </w:r>
+    </w:p>
+    <w:p>
+      <w:pPr>
+        <w:rPr>
+          <w:sz w:val="24"/>
+          <w:szCs w:val="24"/>
+        </w:rPr>
+      </w:pPr>
+    </w:p>
+    <w:p>
+      <w:pPr>
+        <w:rPr>
+          <w:sz w:val="24"/>
+          <w:szCs w:val="24"/>
+        </w:rPr>
+      </w:pPr>
+      <w:r>
+        <w:rPr>
+          <w:sz w:val="24"/>
+          <w:szCs w:val="24"/>
+        </w:rPr>
+        <w:t>=== DAY 10 - 08 June 2026 ===</w:t>
+      </w:r>
+    </w:p>
+    <w:p>
+      <w:pPr>
+        <w:rPr>
+          <w:sz w:val="24"/>
+          <w:szCs w:val="24"/>
+        </w:rPr>
+      </w:pPr>
+      <w:r>
+        <w:rPr>
+          <w:sz w:val="24"/>
+          <w:szCs w:val="24"/>
+        </w:rPr>
+        <w:t>HuggingFace transformers installed</w:t>
+      </w:r>
+    </w:p>
+    <w:p>
+      <w:pPr>
+        <w:rPr>
+          <w:sz w:val="24"/>
+          <w:szCs w:val="24"/>
+        </w:rPr>
+      </w:pPr>
+      <w:r>
+        <w:rPr>
+          <w:sz w:val="24"/>
+          <w:szCs w:val="24"/>
+        </w:rPr>
+        <w:t>GPT-2 and DistilGPT-2 models tested</w:t>
+      </w:r>
+    </w:p>
+    <w:p>
+      <w:pPr>
+        <w:rPr>
+          <w:sz w:val="24"/>
+          <w:szCs w:val="24"/>
+        </w:rPr>
+      </w:pPr>
+      <w:r>
+        <w:rPr>
+          <w:sz w:val="24"/>
+          <w:szCs w:val="24"/>
+        </w:rPr>
+        <w:t>LLM generating alert summaries successfully</w:t>
+      </w:r>
+    </w:p>
+    <w:p>
+      <w:pPr>
+        <w:rPr>
+          <w:sz w:val="24"/>
+          <w:szCs w:val="24"/>
+        </w:rPr>
+      </w:pPr>
+      <w:r>
+        <w:rPr>
+          <w:sz w:val="24"/>
+          <w:szCs w:val="24"/>
+        </w:rPr>
+        <w:t>Model used: distilgpt2</w:t>
+      </w:r>
+    </w:p>
+    <w:p>
+      <w:pPr>
+        <w:rPr>
+          <w:sz w:val="24"/>
+          <w:szCs w:val="24"/>
+        </w:rPr>
+      </w:pPr>
+    </w:p>
+    <w:p>
+      <w:pPr>
+        <w:rPr>
+          <w:sz w:val="24"/>
+          <w:szCs w:val="24"/>
+        </w:rPr>
+      </w:pPr>
+      <w:r>
+        <w:rPr>
+          <w:sz w:val="24"/>
+          <w:szCs w:val="24"/>
+        </w:rPr>
+        <w:t>=== DAY 11 - 09 June 2026 ===</w:t>
+      </w:r>
+    </w:p>
+    <w:p>
+      <w:pPr>
+        <w:rPr>
+          <w:sz w:val="24"/>
+          <w:szCs w:val="24"/>
+        </w:rPr>
+      </w:pPr>
+      <w:r>
+        <w:rPr>
+          <w:sz w:val="24"/>
+          <w:szCs w:val="24"/>
+        </w:rPr>
+        <w:t>Connected XGBoost + SHAP + LLM in one pipeline</w:t>
+      </w:r>
+    </w:p>
+    <w:p>
+      <w:pPr>
+        <w:rPr>
+          <w:sz w:val="24"/>
+          <w:szCs w:val="24"/>
+        </w:rPr>
+      </w:pPr>
+      <w:r>
+        <w:rPr>
+          <w:sz w:val="24"/>
+          <w:szCs w:val="24"/>
+        </w:rPr>
+        <w:t>Benign sample: predicted correctly, top feature = Bwd Packet Length Mean</w:t>
+      </w:r>
+    </w:p>
+    <w:p>
+      <w:pPr>
+        <w:rPr>
+          <w:sz w:val="24"/>
+          <w:szCs w:val="24"/>
+        </w:rPr>
+      </w:pPr>
+      <w:r>
+        <w:rPr>
+          <w:sz w:val="24"/>
+          <w:szCs w:val="24"/>
+        </w:rPr>
+        <w:t>DDoS sample: predicted correctly, top feature = Bwd Packet Length Std</w:t>
+      </w:r>
+    </w:p>
+    <w:p>
+      <w:pPr>
+        <w:rPr>
+          <w:sz w:val="24"/>
+          <w:szCs w:val="24"/>
+        </w:rPr>
+      </w:pPr>
+      <w:r>
+        <w:rPr>
+          <w:sz w:val="24"/>
+          <w:szCs w:val="24"/>
+        </w:rPr>
+        <w:t>LLM generating contextual alert summaries successfully</w:t>
+      </w:r>
+    </w:p>
+    <w:p>
+      <w:pPr>
+        <w:rPr>
+          <w:sz w:val="24"/>
+          <w:szCs w:val="24"/>
+        </w:rPr>
+      </w:pPr>
+      <w:r>
+        <w:rPr>
+          <w:sz w:val="24"/>
+          <w:szCs w:val="24"/>
+        </w:rPr>
+        <w:t>Saved: notebooks/ml_llm.py</w:t>
+      </w:r>
+    </w:p>
+    <w:p>
+      <w:pPr>
+        <w:rPr>
+          <w:sz w:val="24"/>
+          <w:szCs w:val="24"/>
+        </w:rPr>
+      </w:pPr>
+    </w:p>
+    <w:p>
+      <w:pPr>
+        <w:rPr>
+          <w:sz w:val="24"/>
+          <w:szCs w:val="24"/>
+        </w:rPr>
+      </w:pPr>
+      <w:r>
+        <w:rPr>
+          <w:sz w:val="24"/>
+          <w:szCs w:val="24"/>
+        </w:rPr>
+        <w:lastRenderedPageBreak/>
+        <w:t>=== DAY 12 - 1</w:t>
+      </w:r>
+      <w:r>
+        <w:rPr>
+          <w:sz w:val="24"/>
+          <w:szCs w:val="24"/>
+        </w:rPr>
+        <w:t>5</w:t>
+      </w:r>
+      <w:r>
+        <w:rPr>
+          <w:sz w:val="24"/>
+          <w:szCs w:val="24"/>
+        </w:rPr>
+        <w:t xml:space="preserve"> June 2026 ===</w:t>
+      </w:r>
+    </w:p>
+    <w:p>
+      <w:pPr>
+        <w:rPr>
+          <w:sz w:val="24"/>
+          <w:szCs w:val="24"/>
+        </w:rPr>
+      </w:pPr>
+      <w:r>
+        <w:rPr>
+          <w:sz w:val="24"/>
+          <w:szCs w:val="24"/>
+        </w:rPr>
+        <w:t>Streamlit installed</w:t>
+      </w:r>
+    </w:p>
+    <w:p>
+      <w:pPr>
+        <w:rPr>
+          <w:sz w:val="24"/>
+          <w:szCs w:val="24"/>
+        </w:rPr>
+      </w:pPr>
+      <w:r>
+        <w:rPr>
+          <w:sz w:val="24"/>
+          <w:szCs w:val="24"/>
+        </w:rPr>
+        <w:t>Created basic dashboard structure</w:t>
+      </w:r>
+    </w:p>
+    <w:p>
+      <w:pPr>
+        <w:rPr>
+          <w:sz w:val="24"/>
+          <w:szCs w:val="24"/>
+        </w:rPr>
+      </w:pPr>
+      <w:r>
+        <w:rPr>
+          <w:sz w:val="24"/>
+          <w:szCs w:val="24"/>
+        </w:rPr>
+        <w:t>Models and test data loading successfully in the app</w:t>
+      </w:r>
+    </w:p>
+    <w:p>
+      <w:pPr>
+        <w:rPr>
+          <w:sz w:val="24"/>
+          <w:szCs w:val="24"/>
+        </w:rPr>
+      </w:pPr>
+      <w:r>
+        <w:rPr>
+          <w:sz w:val="24"/>
+          <w:szCs w:val="24"/>
+        </w:rPr>
+        <w:t>Saved: app/dashboard.py</w:t>
+      </w:r>
+    </w:p>
+    <w:p>
+      <w:pPr>
+        <w:rPr>
+          <w:sz w:val="24"/>
+          <w:szCs w:val="24"/>
+        </w:rPr>
+      </w:pPr>
+    </w:p>
+    <w:p>
+      <w:pPr>
+        <w:rPr>
+          <w:sz w:val="24"/>
+          <w:szCs w:val="24"/>
+        </w:rPr>
+      </w:pPr>
+      <w:r>
+        <w:rPr>
+          <w:sz w:val="24"/>
+          <w:szCs w:val="24"/>
+        </w:rPr>
+        <w:t>=== DAY 13 - 1</w:t>
+      </w:r>
+      <w:r>
+        <w:rPr>
+          <w:sz w:val="24"/>
+          <w:szCs w:val="24"/>
+        </w:rPr>
+        <w:t>6</w:t>
+      </w:r>
+      <w:r>
+        <w:rPr>
+          <w:sz w:val="24"/>
+          <w:szCs w:val="24"/>
+        </w:rPr>
+        <w:t xml:space="preserve"> June 2026 ===</w:t>
+      </w:r>
+    </w:p>
+    <w:p>
+      <w:pPr>
+        <w:rPr>
+          <w:sz w:val="24"/>
+          <w:szCs w:val="24"/>
+        </w:rPr>
+      </w:pPr>
+      <w:r>
+        <w:rPr>
+          <w:sz w:val="24"/>
+          <w:szCs w:val="24"/>
+        </w:rPr>
+        <w:t>Added interactive prediction interface to Streamlit dashboard</w:t>
+      </w:r>
+    </w:p>
+    <w:p>
+      <w:pPr>
+        <w:rPr>
+          <w:sz w:val="24"/>
+          <w:szCs w:val="24"/>
+        </w:rPr>
+      </w:pPr>
+      <w:r>
+        <w:rPr>
+          <w:sz w:val="24"/>
+          <w:szCs w:val="24"/>
+        </w:rPr>
+        <w:t>User can input sample index and get live prediction</w:t>
+      </w:r>
+    </w:p>
+    <w:p>
+      <w:pPr>
+        <w:rPr>
+          <w:sz w:val="24"/>
+          <w:szCs w:val="24"/>
+        </w:rPr>
+      </w:pPr>
+      <w:r>
+        <w:rPr>
+          <w:sz w:val="24"/>
+          <w:szCs w:val="24"/>
+        </w:rPr>
+        <w:t>Benign traffic shows green success alert</w:t>
+      </w:r>
+    </w:p>
+    <w:p>
+      <w:pPr>
+        <w:rPr>
+          <w:sz w:val="24"/>
+          <w:szCs w:val="24"/>
+        </w:rPr>
+      </w:pPr>
+      <w:r>
+        <w:rPr>
+          <w:sz w:val="24"/>
+          <w:szCs w:val="24"/>
+        </w:rPr>
+        <w:t>DDoS traffic shows red error alert with confidence score</w:t>
+      </w:r>
+    </w:p>
+    <w:p>
+      <w:pPr>
+        <w:rPr>
+          <w:sz w:val="24"/>
+          <w:szCs w:val="24"/>
+        </w:rPr>
+      </w:pPr>
+      <w:r>
+        <w:rPr>
+          <w:sz w:val="24"/>
+          <w:szCs w:val="24"/>
+        </w:rPr>
+        <w:t>Tested successfully on both classes</w:t>
+      </w:r>
+    </w:p>
+    <w:p>
+      <w:pPr>
+        <w:rPr>
+          <w:sz w:val="24"/>
+          <w:szCs w:val="24"/>
+        </w:rPr>
+      </w:pPr>
+    </w:p>
+    <w:p>
+      <w:pPr>
+        <w:rPr>
+          <w:sz w:val="24"/>
+          <w:szCs w:val="24"/>
+        </w:rPr>
+      </w:pPr>
+      <w:r>
+        <w:rPr>
+          <w:sz w:val="24"/>
+          <w:szCs w:val="24"/>
+        </w:rPr>
+        <w:t>=== DAY 14 - 18 June 2026 ===</w:t>
+      </w:r>
+    </w:p>
+    <w:p>
+      <w:pPr>
+        <w:rPr>
+          <w:sz w:val="24"/>
+          <w:szCs w:val="24"/>
+        </w:rPr>
+      </w:pPr>
+      <w:r>
+        <w:rPr>
+          <w:sz w:val="24"/>
+          <w:szCs w:val="24"/>
+        </w:rPr>
+        <w:t>Added SHAP explanation section to dashboard</w:t>
+      </w:r>
+    </w:p>
+    <w:p>
+      <w:pPr>
+        <w:rPr>
+          <w:sz w:val="24"/>
+          <w:szCs w:val="24"/>
+        </w:rPr>
+      </w:pPr>
+      <w:r>
+        <w:rPr>
+          <w:sz w:val="24"/>
+          <w:szCs w:val="24"/>
+        </w:rPr>
+        <w:t>Added Top 5 features bar chart</w:t>
+      </w:r>
+    </w:p>
+    <w:p>
+      <w:pPr>
+        <w:rPr>
+          <w:sz w:val="24"/>
+          <w:szCs w:val="24"/>
+        </w:rPr>
+      </w:pPr>
+      <w:r>
+        <w:rPr>
+          <w:sz w:val="24"/>
+          <w:szCs w:val="24"/>
+        </w:rPr>
+        <w:t>Added LLM Alert Summary section</w:t>
+      </w:r>
+    </w:p>
+    <w:p>
+      <w:pPr>
+        <w:rPr>
+          <w:sz w:val="24"/>
+          <w:szCs w:val="24"/>
+        </w:rPr>
+      </w:pPr>
+      <w:r>
+        <w:rPr>
+          <w:sz w:val="24"/>
+          <w:szCs w:val="24"/>
+        </w:rPr>
+        <w:t>Full pipeline working on dashboard:</w:t>
+      </w:r>
+    </w:p>
+    <w:p>
+      <w:pPr>
+        <w:rPr>
+          <w:sz w:val="24"/>
+          <w:szCs w:val="24"/>
+        </w:rPr>
+      </w:pPr>
+      <w:r>
+        <w:rPr>
+          <w:sz w:val="24"/>
+          <w:szCs w:val="24"/>
+        </w:rPr>
+        <w:t>ML prediction → SHAP explanation → LLM summary</w:t>
+      </w:r>
+    </w:p>
+    <w:p>
+      <w:pPr>
+        <w:rPr>
+          <w:sz w:val="24"/>
+          <w:szCs w:val="24"/>
+        </w:rPr>
+      </w:pPr>
+      <w:r>
+        <w:rPr>
+          <w:sz w:val="24"/>
+          <w:szCs w:val="24"/>
+        </w:rPr>
+        <w:t>Saved: app/dashboard.py</w:t>
       </w:r>
     </w:p>
     <w:sectPr>

</xml_diff>